<commit_message>
feat: expand Bezy campaign and game experience
</commit_message>
<xml_diff>
--- a/Bezy Product Specification/BEZY_Technical_Development_Specification_EN.docx
+++ b/Bezy Product Specification/BEZY_Technical_Development_Specification_EN.docx
@@ -6976,13 +6976,7 @@
             <w:vAlign w:val="center"/>
           </w:tcPr>
           <w:p>
-            <w:pPr>
-              <w:spacing w:after="0" w:line="240" w:lineRule="auto"/>
-            </w:pPr>
-            <w:r>
-              <w:rPr>
-                <w:sz w:val="16"/>
-              </w:rPr>
+            <w:r>
               <w:t>Ice</w:t>
             </w:r>
           </w:p>
@@ -7000,14 +6994,8 @@
             <w:vAlign w:val="center"/>
           </w:tcPr>
           <w:p>
-            <w:pPr>
-              <w:spacing w:after="0" w:line="240" w:lineRule="auto"/>
-            </w:pPr>
-            <w:r>
-              <w:rPr>
-                <w:sz w:val="16"/>
-              </w:rPr>
-              <w:t>Forces continued direction</w:t>
+            <w:r>
+              <w:t>Slides automatically in the entry direction until the first normal stop cell, obstacle, or board edge</w:t>
             </w:r>
           </w:p>
         </w:tc>
@@ -7024,14 +7012,8 @@
             <w:vAlign w:val="center"/>
           </w:tcPr>
           <w:p>
-            <w:pPr>
-              <w:spacing w:after="0" w:line="240" w:lineRule="auto"/>
-            </w:pPr>
-            <w:r>
-              <w:rPr>
-                <w:sz w:val="16"/>
-              </w:rPr>
-              <w:t>Visible directional rule</w:t>
+            <w:r>
+              <w:t>Direction arrow, ice trail, and preview of the stop cell</w:t>
             </w:r>
           </w:p>
         </w:tc>
@@ -7103,6 +7085,165 @@
                 <w:sz w:val="16"/>
               </w:rPr>
               <w:t>Short transition with preserved context</w:t>
+            </w:r>
+          </w:p>
+        </w:tc>
+      </w:tr>
+      <w:tr>
+        <w:tc>
+          <w:tcPr>
+            <w:tcW w:type="dxa" w:w="1800"/>
+            <w:tcMar>
+              <w:top w:w="110" w:type="dxa"/>
+              <w:start w:w="110" w:type="dxa"/>
+              <w:bottom w:w="110" w:type="dxa"/>
+              <w:end w:w="110" w:type="dxa"/>
+            </w:tcMar>
+            <w:vAlign w:val="center"/>
+          </w:tcPr>
+          <w:p>
+            <w:r>
+              <w:t>Mirror</w:t>
+            </w:r>
+          </w:p>
+        </w:tc>
+        <w:tc>
+          <w:tcPr>
+            <w:tcW w:type="dxa" w:w="4608"/>
+            <w:tcMar>
+              <w:top w:w="110" w:type="dxa"/>
+              <w:start w:w="110" w:type="dxa"/>
+              <w:bottom w:w="110" w:type="dxa"/>
+              <w:end w:w="110" w:type="dxa"/>
+            </w:tcMar>
+            <w:vAlign w:val="center"/>
+          </w:tcPr>
+          <w:p>
+            <w:r>
+              <w:t>Reverses the digits of the current total, such as 23 becoming 32; there is no separate Swap mechanic</w:t>
+            </w:r>
+          </w:p>
+        </w:tc>
+        <w:tc>
+          <w:tcPr>
+            <w:tcW w:type="dxa" w:w="2808"/>
+            <w:tcMar>
+              <w:top w:w="110" w:type="dxa"/>
+              <w:start w:w="110" w:type="dxa"/>
+              <w:bottom w:w="110" w:type="dxa"/>
+              <w:end w:w="110" w:type="dxa"/>
+            </w:tcMar>
+            <w:vAlign w:val="center"/>
+          </w:tcPr>
+          <w:p>
+            <w:r>
+              <w:t>Reflection animation with before and after totals</w:t>
+            </w:r>
+          </w:p>
+        </w:tc>
+      </w:tr>
+      <w:tr>
+        <w:tc>
+          <w:tcPr>
+            <w:tcW w:type="dxa" w:w="1800"/>
+            <w:tcMar>
+              <w:top w:w="110" w:type="dxa"/>
+              <w:start w:w="110" w:type="dxa"/>
+              <w:bottom w:w="110" w:type="dxa"/>
+              <w:end w:w="110" w:type="dxa"/>
+            </w:tcMar>
+            <w:vAlign w:val="center"/>
+          </w:tcPr>
+          <w:p>
+            <w:r>
+              <w:t>Joker</w:t>
+            </w:r>
+          </w:p>
+        </w:tc>
+        <w:tc>
+          <w:tcPr>
+            <w:tcW w:type="dxa" w:w="4608"/>
+            <w:tcMar>
+              <w:top w:w="110" w:type="dxa"/>
+              <w:start w:w="110" w:type="dxa"/>
+              <w:bottom w:w="110" w:type="dxa"/>
+              <w:end w:w="110" w:type="dxa"/>
+            </w:tcMar>
+            <w:vAlign w:val="center"/>
+          </w:tcPr>
+          <w:p>
+            <w:r>
+              <w:t>Offers two level-defined numeric actions; the player chooses one within the same move</w:t>
+            </w:r>
+          </w:p>
+        </w:tc>
+        <w:tc>
+          <w:tcPr>
+            <w:tcW w:type="dxa" w:w="2808"/>
+            <w:tcMar>
+              <w:top w:w="110" w:type="dxa"/>
+              <w:start w:w="110" w:type="dxa"/>
+              <w:bottom w:w="110" w:type="dxa"/>
+              <w:end w:w="110" w:type="dxa"/>
+            </w:tcMar>
+            <w:vAlign w:val="center"/>
+          </w:tcPr>
+          <w:p>
+            <w:r>
+              <w:t>Two large choices with resulting-total previews</w:t>
+            </w:r>
+          </w:p>
+        </w:tc>
+      </w:tr>
+      <w:tr>
+        <w:tc>
+          <w:tcPr>
+            <w:tcW w:type="dxa" w:w="1800"/>
+            <w:tcMar>
+              <w:top w:w="110" w:type="dxa"/>
+              <w:start w:w="110" w:type="dxa"/>
+              <w:bottom w:w="110" w:type="dxa"/>
+              <w:end w:w="110" w:type="dxa"/>
+            </w:tcMar>
+            <w:vAlign w:val="center"/>
+          </w:tcPr>
+          <w:p>
+            <w:r>
+              <w:t>Lonely Cell</w:t>
+            </w:r>
+          </w:p>
+        </w:tc>
+        <w:tc>
+          <w:tcPr>
+            <w:tcW w:type="dxa" w:w="4608"/>
+            <w:tcMar>
+              <w:top w:w="110" w:type="dxa"/>
+              <w:start w:w="110" w:type="dxa"/>
+              <w:bottom w:w="110" w:type="dxa"/>
+              <w:end w:w="110" w:type="dxa"/>
+            </w:tcMar>
+            <w:vAlign w:val="center"/>
+          </w:tcPr>
+          <w:p>
+            <w:r>
+              <w:t>Enterable only after all four orthogonally adjacent cells are already pressed in the active path</w:t>
+            </w:r>
+          </w:p>
+        </w:tc>
+        <w:tc>
+          <w:tcPr>
+            <w:tcW w:type="dxa" w:w="2808"/>
+            <w:tcMar>
+              <w:top w:w="110" w:type="dxa"/>
+              <w:start w:w="110" w:type="dxa"/>
+              <w:bottom w:w="110" w:type="dxa"/>
+              <w:end w:w="110" w:type="dxa"/>
+            </w:tcMar>
+            <w:vAlign w:val="center"/>
+          </w:tcPr>
+          <w:p>
+            <w:r>
+              <w:t>Four neighbor indicators and a clear locked-to-available transition</w:t>
             </w:r>
           </w:p>
         </w:tc>
@@ -7841,6 +7982,310 @@
         <w:t>GAME 014 requires that Challenge mode expose no hint action, shortcut, deep link, accessibility action, or solution route. GAME 015 requires that solution playback never records a Challenge completion, medal, best score, or progression unlock that depends on independent completion.</w:t>
       </w:r>
     </w:p>
+    <w:p>
+      <w:pPr>
+        <w:pStyle w:val="Heading2"/>
+      </w:pPr>
+      <w:r>
+        <w:t>Additional level rules</w:t>
+      </w:r>
+    </w:p>
+    <w:p>
+      <w:pPr>
+        <w:pStyle w:val="ListBullet"/>
+      </w:pPr>
+      <w:r>
+        <w:t>GAME 016 restricts Mirror, Joker, Ice, Lonely Cell, mandatory timers, and minimum-move objectives to levels 21 through 50. Levels 1 through 20 remain the introductory set and are not retrofitted with these rules.</w:t>
+      </w:r>
+    </w:p>
+    <w:p>
+      <w:pPr>
+        <w:pStyle w:val="ListBullet"/>
+      </w:pPr>
+      <w:r>
+        <w:t>GAME 017 stores a solver-verified optimalMoves value for every additional level. Exact-target completion remains valid, but the highest Challenge medal requires moves equal to optimalMoves. The exact optimum is revealed after the first completion while current moves and the personal best remain visible during play.</w:t>
+      </w:r>
+    </w:p>
+    <w:p>
+      <w:pPr>
+        <w:pStyle w:val="ListBullet"/>
+      </w:pPr>
+      <w:r>
+        <w:t>GAME 018 starts the Challenge countdown on the first valid start-cell selection. Levels 21 through 30 allow 60 seconds, levels 31 through 40 allow 45 seconds, and levels 41 through 50 allow 30 seconds. Timeout ends the attempt without progression and offers an immediate restart.</w:t>
+      </w:r>
+    </w:p>
+    <w:p>
+      <w:pPr>
+        <w:pStyle w:val="ListBullet"/>
+      </w:pPr>
+      <w:r>
+        <w:t>GAME 019 pauses the countdown while the application is backgrounded or interrupted by the operating system. Ordinary in-game panels do not pause it. Learning mode teaches the same cells without a time-failure condition.</w:t>
+      </w:r>
+    </w:p>
+    <w:p>
+      <w:pPr>
+        <w:pStyle w:val="ListBullet"/>
+      </w:pPr>
+      <w:r>
+        <w:t>GAME 020 defines Joker as a choice between two numeric actions stored in level data. Both resulting totals are previewed before confirmation, both branches are supported by the solver, and undo reverses the complete Joker move.</w:t>
+      </w:r>
+    </w:p>
+    <w:p>
+      <w:pPr>
+        <w:pStyle w:val="ListBullet"/>
+      </w:pPr>
+      <w:r>
+        <w:t>GAME 021 defines Ice as automatic travel in the entry direction until the first normal stop cell, obstacle, or board edge. Direction cannot change during the slide and the destination is previewed before entry.</w:t>
+      </w:r>
+    </w:p>
+    <w:p>
+      <w:pPr>
+        <w:pStyle w:val="ListBullet"/>
+      </w:pPr>
+      <w:r>
+        <w:t>GAME 022 defines Lonely Cell as enterable only when its four orthogonal neighbors are already in the active path. It cannot be placed on an edge. Backtracking that removes a required neighbor locks it again, and its configured numeric value applies on entry.</w:t>
+      </w:r>
+    </w:p>
+    <w:p>
+      <w:pPr>
+        <w:pStyle w:val="ListBullet"/>
+      </w:pPr>
+      <w:r>
+        <w:t>GAME 023 confirms that Mirror is the existing digit-reversal mechanic. No separate Swap tile or duplicated rule is introduced.</w:t>
+      </w:r>
+    </w:p>
+    <w:tbl>
+      <w:tblPr>
+        <w:tblStyle w:val="TableGrid"/>
+        <w:tblW w:type="auto" w:w="0"/>
+        <w:jc w:val="center"/>
+        <w:tblLayout w:type="fixed"/>
+        <w:tblLook w:firstColumn="1" w:firstRow="1" w:lastColumn="0" w:lastRow="0" w:noHBand="0" w:noVBand="1" w:val="04A0"/>
+      </w:tblPr>
+      <w:tblGrid>
+        <w:gridCol w:w="3331"/>
+        <w:gridCol w:w="3331"/>
+        <w:gridCol w:w="3331"/>
+      </w:tblGrid>
+      <w:tr>
+        <w:trPr>
+          <w:tblHeader w:val="true"/>
+        </w:trPr>
+        <w:tc>
+          <w:tcPr>
+            <w:tcW w:type="dxa" w:w="1800"/>
+            <w:tcMar>
+              <w:top w:w="110" w:type="dxa"/>
+              <w:start w:w="110" w:type="dxa"/>
+              <w:bottom w:w="110" w:type="dxa"/>
+              <w:end w:w="110" w:type="dxa"/>
+            </w:tcMar>
+            <w:shd w:fill="17324D"/>
+            <w:vAlign w:val="center"/>
+          </w:tcPr>
+          <w:p>
+            <w:r>
+              <w:t>Level range</w:t>
+            </w:r>
+          </w:p>
+        </w:tc>
+        <w:tc>
+          <w:tcPr>
+            <w:tcW w:type="dxa" w:w="4608"/>
+            <w:tcMar>
+              <w:top w:w="110" w:type="dxa"/>
+              <w:start w:w="110" w:type="dxa"/>
+              <w:bottom w:w="110" w:type="dxa"/>
+              <w:end w:w="110" w:type="dxa"/>
+            </w:tcMar>
+            <w:shd w:fill="17324D"/>
+            <w:vAlign w:val="center"/>
+          </w:tcPr>
+          <w:p>
+            <w:r>
+              <w:t>Challenge timer</w:t>
+            </w:r>
+          </w:p>
+        </w:tc>
+        <w:tc>
+          <w:tcPr>
+            <w:tcW w:type="dxa" w:w="2808"/>
+            <w:tcMar>
+              <w:top w:w="110" w:type="dxa"/>
+              <w:start w:w="110" w:type="dxa"/>
+              <w:bottom w:w="110" w:type="dxa"/>
+              <w:end w:w="110" w:type="dxa"/>
+            </w:tcMar>
+            <w:shd w:fill="17324D"/>
+            <w:vAlign w:val="center"/>
+          </w:tcPr>
+          <w:p>
+            <w:r>
+              <w:t>Primary additions</w:t>
+            </w:r>
+          </w:p>
+        </w:tc>
+      </w:tr>
+      <w:tr>
+        <w:tc>
+          <w:tcPr>
+            <w:tcW w:type="dxa" w:w="1800"/>
+            <w:tcMar>
+              <w:top w:w="110" w:type="dxa"/>
+              <w:start w:w="110" w:type="dxa"/>
+              <w:bottom w:w="110" w:type="dxa"/>
+              <w:end w:w="110" w:type="dxa"/>
+            </w:tcMar>
+            <w:vAlign w:val="center"/>
+          </w:tcPr>
+          <w:p>
+            <w:r>
+              <w:t>21 through 30</w:t>
+            </w:r>
+          </w:p>
+        </w:tc>
+        <w:tc>
+          <w:tcPr>
+            <w:tcW w:type="dxa" w:w="4608"/>
+            <w:tcMar>
+              <w:top w:w="110" w:type="dxa"/>
+              <w:start w:w="110" w:type="dxa"/>
+              <w:bottom w:w="110" w:type="dxa"/>
+              <w:end w:w="110" w:type="dxa"/>
+            </w:tcMar>
+            <w:vAlign w:val="center"/>
+          </w:tcPr>
+          <w:p>
+            <w:r>
+              <w:t>60 seconds</w:t>
+            </w:r>
+          </w:p>
+        </w:tc>
+        <w:tc>
+          <w:tcPr>
+            <w:tcW w:type="dxa" w:w="2808"/>
+            <w:tcMar>
+              <w:top w:w="110" w:type="dxa"/>
+              <w:start w:w="110" w:type="dxa"/>
+              <w:bottom w:w="110" w:type="dxa"/>
+              <w:end w:w="110" w:type="dxa"/>
+            </w:tcMar>
+            <w:vAlign w:val="center"/>
+          </w:tcPr>
+          <w:p>
+            <w:r>
+              <w:t>Mirror, Joker, and minimum-move objectives</w:t>
+            </w:r>
+          </w:p>
+        </w:tc>
+      </w:tr>
+      <w:tr>
+        <w:tc>
+          <w:tcPr>
+            <w:tcW w:type="dxa" w:w="1800"/>
+            <w:tcMar>
+              <w:top w:w="110" w:type="dxa"/>
+              <w:start w:w="110" w:type="dxa"/>
+              <w:bottom w:w="110" w:type="dxa"/>
+              <w:end w:w="110" w:type="dxa"/>
+            </w:tcMar>
+            <w:vAlign w:val="center"/>
+          </w:tcPr>
+          <w:p>
+            <w:r>
+              <w:t>31 through 40</w:t>
+            </w:r>
+          </w:p>
+        </w:tc>
+        <w:tc>
+          <w:tcPr>
+            <w:tcW w:type="dxa" w:w="4608"/>
+            <w:tcMar>
+              <w:top w:w="110" w:type="dxa"/>
+              <w:start w:w="110" w:type="dxa"/>
+              <w:bottom w:w="110" w:type="dxa"/>
+              <w:end w:w="110" w:type="dxa"/>
+            </w:tcMar>
+            <w:vAlign w:val="center"/>
+          </w:tcPr>
+          <w:p>
+            <w:r>
+              <w:t>45 seconds</w:t>
+            </w:r>
+          </w:p>
+        </w:tc>
+        <w:tc>
+          <w:tcPr>
+            <w:tcW w:type="dxa" w:w="2808"/>
+            <w:tcMar>
+              <w:top w:w="110" w:type="dxa"/>
+              <w:start w:w="110" w:type="dxa"/>
+              <w:bottom w:w="110" w:type="dxa"/>
+              <w:end w:w="110" w:type="dxa"/>
+            </w:tcMar>
+            <w:vAlign w:val="center"/>
+          </w:tcPr>
+          <w:p>
+            <w:r>
+              <w:t>Ice and combined Joker decisions</w:t>
+            </w:r>
+          </w:p>
+        </w:tc>
+      </w:tr>
+      <w:tr>
+        <w:tc>
+          <w:tcPr>
+            <w:tcW w:type="dxa" w:w="1800"/>
+            <w:tcMar>
+              <w:top w:w="110" w:type="dxa"/>
+              <w:start w:w="110" w:type="dxa"/>
+              <w:bottom w:w="110" w:type="dxa"/>
+              <w:end w:w="110" w:type="dxa"/>
+            </w:tcMar>
+            <w:vAlign w:val="center"/>
+          </w:tcPr>
+          <w:p>
+            <w:r>
+              <w:t>41 through 50</w:t>
+            </w:r>
+          </w:p>
+        </w:tc>
+        <w:tc>
+          <w:tcPr>
+            <w:tcW w:type="dxa" w:w="4608"/>
+            <w:tcMar>
+              <w:top w:w="110" w:type="dxa"/>
+              <w:start w:w="110" w:type="dxa"/>
+              <w:bottom w:w="110" w:type="dxa"/>
+              <w:end w:w="110" w:type="dxa"/>
+            </w:tcMar>
+            <w:vAlign w:val="center"/>
+          </w:tcPr>
+          <w:p>
+            <w:r>
+              <w:t>30 seconds</w:t>
+            </w:r>
+          </w:p>
+        </w:tc>
+        <w:tc>
+          <w:tcPr>
+            <w:tcW w:type="dxa" w:w="2808"/>
+            <w:tcMar>
+              <w:top w:w="110" w:type="dxa"/>
+              <w:start w:w="110" w:type="dxa"/>
+              <w:bottom w:w="110" w:type="dxa"/>
+              <w:end w:w="110" w:type="dxa"/>
+            </w:tcMar>
+            <w:vAlign w:val="center"/>
+          </w:tcPr>
+          <w:p>
+            <w:r>
+              <w:t>Lonely Cell and combined mastery</w:t>
+            </w:r>
+          </w:p>
+        </w:tc>
+      </w:tr>
+    </w:tbl>
     <w:p>
       <w:r>
         <w:br w:type="page"/>
@@ -9290,6 +9735,230 @@
           </w:p>
         </w:tc>
       </w:tr>
+      <w:tr>
+        <w:tc>
+          <w:tcPr>
+            <w:tcW w:type="dxa" w:w="2520"/>
+            <w:tcMar>
+              <w:top w:w="110" w:type="dxa"/>
+              <w:start w:w="110" w:type="dxa"/>
+              <w:bottom w:w="110" w:type="dxa"/>
+              <w:end w:w="110" w:type="dxa"/>
+            </w:tcMar>
+            <w:shd w:fill="EEF4F8"/>
+            <w:vAlign w:val="center"/>
+          </w:tcPr>
+          <w:p>
+            <w:r>
+              <w:t>optimalMoves</w:t>
+            </w:r>
+          </w:p>
+        </w:tc>
+        <w:tc>
+          <w:tcPr>
+            <w:tcW w:type="dxa" w:w="1296"/>
+            <w:tcMar>
+              <w:top w:w="110" w:type="dxa"/>
+              <w:start w:w="110" w:type="dxa"/>
+              <w:bottom w:w="110" w:type="dxa"/>
+              <w:end w:w="110" w:type="dxa"/>
+            </w:tcMar>
+            <w:shd w:fill="EEF4F8"/>
+            <w:vAlign w:val="center"/>
+          </w:tcPr>
+          <w:p>
+            <w:r>
+              <w:t>Levels 21 to 50</w:t>
+            </w:r>
+          </w:p>
+        </w:tc>
+        <w:tc>
+          <w:tcPr>
+            <w:tcW w:type="dxa" w:w="5400"/>
+            <w:tcMar>
+              <w:top w:w="110" w:type="dxa"/>
+              <w:start w:w="110" w:type="dxa"/>
+              <w:bottom w:w="110" w:type="dxa"/>
+              <w:end w:w="110" w:type="dxa"/>
+            </w:tcMar>
+            <w:shd w:fill="EEF4F8"/>
+            <w:vAlign w:val="center"/>
+          </w:tcPr>
+          <w:p>
+            <w:r>
+              <w:t>Solver-verified minimum used for Challenge medals</w:t>
+            </w:r>
+          </w:p>
+        </w:tc>
+      </w:tr>
+      <w:tr>
+        <w:tc>
+          <w:tcPr>
+            <w:tcW w:type="dxa" w:w="2520"/>
+            <w:tcMar>
+              <w:top w:w="110" w:type="dxa"/>
+              <w:start w:w="110" w:type="dxa"/>
+              <w:bottom w:w="110" w:type="dxa"/>
+              <w:end w:w="110" w:type="dxa"/>
+            </w:tcMar>
+            <w:shd w:fill="EEF4F8"/>
+            <w:vAlign w:val="center"/>
+          </w:tcPr>
+          <w:p>
+            <w:r>
+              <w:t>challengeTimeSeconds</w:t>
+            </w:r>
+          </w:p>
+        </w:tc>
+        <w:tc>
+          <w:tcPr>
+            <w:tcW w:type="dxa" w:w="1296"/>
+            <w:tcMar>
+              <w:top w:w="110" w:type="dxa"/>
+              <w:start w:w="110" w:type="dxa"/>
+              <w:bottom w:w="110" w:type="dxa"/>
+              <w:end w:w="110" w:type="dxa"/>
+            </w:tcMar>
+            <w:shd w:fill="EEF4F8"/>
+            <w:vAlign w:val="center"/>
+          </w:tcPr>
+          <w:p>
+            <w:r>
+              <w:t>Levels 21 to 50</w:t>
+            </w:r>
+          </w:p>
+        </w:tc>
+        <w:tc>
+          <w:tcPr>
+            <w:tcW w:type="dxa" w:w="5400"/>
+            <w:tcMar>
+              <w:top w:w="110" w:type="dxa"/>
+              <w:start w:w="110" w:type="dxa"/>
+              <w:bottom w:w="110" w:type="dxa"/>
+              <w:end w:w="110" w:type="dxa"/>
+            </w:tcMar>
+            <w:shd w:fill="EEF4F8"/>
+            <w:vAlign w:val="center"/>
+          </w:tcPr>
+          <w:p>
+            <w:r>
+              <w:t>60, 45, or 30 according to the approved tier</w:t>
+            </w:r>
+          </w:p>
+        </w:tc>
+      </w:tr>
+      <w:tr>
+        <w:tc>
+          <w:tcPr>
+            <w:tcW w:type="dxa" w:w="2520"/>
+            <w:tcMar>
+              <w:top w:w="110" w:type="dxa"/>
+              <w:start w:w="110" w:type="dxa"/>
+              <w:bottom w:w="110" w:type="dxa"/>
+              <w:end w:w="110" w:type="dxa"/>
+            </w:tcMar>
+            <w:shd w:fill="EEF4F8"/>
+            <w:vAlign w:val="center"/>
+          </w:tcPr>
+          <w:p>
+            <w:r>
+              <w:t>jokerOptions</w:t>
+            </w:r>
+          </w:p>
+        </w:tc>
+        <w:tc>
+          <w:tcPr>
+            <w:tcW w:type="dxa" w:w="1296"/>
+            <w:tcMar>
+              <w:top w:w="110" w:type="dxa"/>
+              <w:start w:w="110" w:type="dxa"/>
+              <w:bottom w:w="110" w:type="dxa"/>
+              <w:end w:w="110" w:type="dxa"/>
+            </w:tcMar>
+            <w:shd w:fill="EEF4F8"/>
+            <w:vAlign w:val="center"/>
+          </w:tcPr>
+          <w:p>
+            <w:r>
+              <w:t>When Joker is present</w:t>
+            </w:r>
+          </w:p>
+        </w:tc>
+        <w:tc>
+          <w:tcPr>
+            <w:tcW w:type="dxa" w:w="5400"/>
+            <w:tcMar>
+              <w:top w:w="110" w:type="dxa"/>
+              <w:start w:w="110" w:type="dxa"/>
+              <w:bottom w:w="110" w:type="dxa"/>
+              <w:end w:w="110" w:type="dxa"/>
+            </w:tcMar>
+            <w:shd w:fill="EEF4F8"/>
+            <w:vAlign w:val="center"/>
+          </w:tcPr>
+          <w:p>
+            <w:r>
+              <w:t>Exactly two deterministic numeric actions</w:t>
+            </w:r>
+          </w:p>
+        </w:tc>
+      </w:tr>
+      <w:tr>
+        <w:tc>
+          <w:tcPr>
+            <w:tcW w:type="dxa" w:w="2520"/>
+            <w:tcMar>
+              <w:top w:w="110" w:type="dxa"/>
+              <w:start w:w="110" w:type="dxa"/>
+              <w:bottom w:w="110" w:type="dxa"/>
+              <w:end w:w="110" w:type="dxa"/>
+            </w:tcMar>
+            <w:shd w:fill="EEF4F8"/>
+            <w:vAlign w:val="center"/>
+          </w:tcPr>
+          <w:p>
+            <w:r>
+              <w:t>lonelyCellValue</w:t>
+            </w:r>
+          </w:p>
+        </w:tc>
+        <w:tc>
+          <w:tcPr>
+            <w:tcW w:type="dxa" w:w="1296"/>
+            <w:tcMar>
+              <w:top w:w="110" w:type="dxa"/>
+              <w:start w:w="110" w:type="dxa"/>
+              <w:bottom w:w="110" w:type="dxa"/>
+              <w:end w:w="110" w:type="dxa"/>
+            </w:tcMar>
+            <w:shd w:fill="EEF4F8"/>
+            <w:vAlign w:val="center"/>
+          </w:tcPr>
+          <w:p>
+            <w:r>
+              <w:t>When Lonely Cell is present</w:t>
+            </w:r>
+          </w:p>
+        </w:tc>
+        <w:tc>
+          <w:tcPr>
+            <w:tcW w:type="dxa" w:w="5400"/>
+            <w:tcMar>
+              <w:top w:w="110" w:type="dxa"/>
+              <w:start w:w="110" w:type="dxa"/>
+              <w:bottom w:w="110" w:type="dxa"/>
+              <w:end w:w="110" w:type="dxa"/>
+            </w:tcMar>
+            <w:shd w:fill="EEF4F8"/>
+            <w:vAlign w:val="center"/>
+          </w:tcPr>
+          <w:p>
+            <w:r>
+              <w:t>Numeric value applied after its four-neighbor gate opens</w:t>
+            </w:r>
+          </w:p>
+        </w:tc>
+      </w:tr>
     </w:tbl>
     <w:p/>
     <w:p>
@@ -9363,6 +10032,54 @@
       </w:pPr>
       <w:r>
         <w:t>TEST 027 a native speaker and educator approve each localized hint set.</w:t>
+      </w:r>
+    </w:p>
+    <w:p>
+      <w:pPr>
+        <w:pStyle w:val="ListBullet"/>
+      </w:pPr>
+      <w:r>
+        <w:t>TEST 028 verifies that levels 1 through 20 contain none of the additional-level-only rules.</w:t>
+      </w:r>
+    </w:p>
+    <w:p>
+      <w:pPr>
+        <w:pStyle w:val="ListBullet"/>
+      </w:pPr>
+      <w:r>
+        <w:t>TEST 029 verifies optimalMoves against the shortest valid exact-target solution for every level from 21 through 50.</w:t>
+      </w:r>
+    </w:p>
+    <w:p>
+      <w:pPr>
+        <w:pStyle w:val="ListBullet"/>
+      </w:pPr>
+      <w:r>
+        <w:t>TEST 030 verifies the 60, 45, and 30 second tiers, monotonic countdown behavior, background pause, timeout failure, and restart.</w:t>
+      </w:r>
+    </w:p>
+    <w:p>
+      <w:pPr>
+        <w:pStyle w:val="ListBullet"/>
+      </w:pPr>
+      <w:r>
+        <w:t>TEST 031 verifies both Joker branches in gameplay, undo, hint evaluation, and solver output.</w:t>
+      </w:r>
+    </w:p>
+    <w:p>
+      <w:pPr>
+        <w:pStyle w:val="ListBullet"/>
+      </w:pPr>
+      <w:r>
+        <w:t>TEST 032 verifies Ice stopping, obstacle and edge behavior, route recording, and solver parity.</w:t>
+      </w:r>
+    </w:p>
+    <w:p>
+      <w:pPr>
+        <w:pStyle w:val="ListBullet"/>
+      </w:pPr>
+      <w:r>
+        <w:t>TEST 033 verifies Lonely Cell placement, four-neighbor unlocking, backtrack relocking, numeric effect, and solver parity.</w:t>
       </w:r>
     </w:p>
     <w:p>

</xml_diff>